<commit_message>
fix(docs): synchronize student class to CNTT K23L and correct ports across all report formats
</commit_message>
<xml_diff>
--- a/docs/BAO_CAO_CHI_TIET_DU_AN_WEBSITE_TUYEN_DUNG_ICTU.docx
+++ b/docs/BAO_CAO_CHI_TIET_DU_AN_WEBSITE_TUYEN_DUNG_ICTU.docx
@@ -173,7 +173,7 @@
         <w:t>Lớp:</w:t>
       </w:r>
       <w:r>
-        <w:t xml:space="preserve"> CNTT K24</w:t>
+        <w:t xml:space="preserve"> CNTT K23L</w:t>
       </w:r>
     </w:p>
     <w:p>
@@ -189,7 +189,7 @@
         <w:t>Khoá học:</w:t>
       </w:r>
       <w:r>
-        <w:t xml:space="preserve"> 2024 – 2028 (K24)</w:t>
+        <w:t xml:space="preserve"> 2023 – 2027 (K23L)</w:t>
       </w:r>
     </w:p>
     <w:p>
@@ -237,7 +237,7 @@
         <w:t>Giảng viên phản biện:</w:t>
       </w:r>
       <w:r>
-        <w:t xml:space="preserve"> TS. Trần Văn Minh</w:t>
+        <w:t xml:space="preserve"> TS.</w:t>
       </w:r>
     </w:p>
     <w:p>
@@ -294,9 +294,7 @@
       <w:r/>
     </w:p>
     <w:p>
-      <w:r>
-        <w:br w:type="page"/>
-      </w:r>
+      <w:r/>
     </w:p>
     <w:p>
       <w:pPr>
@@ -372,7 +370,7 @@
         <w:t>4. Lớp:</w:t>
       </w:r>
       <w:r>
-        <w:t xml:space="preserve"> CNTT K24 — </w:t>
+        <w:t xml:space="preserve"> CNTT K23L — </w:t>
       </w:r>
       <w:r>
         <w:rPr>
@@ -622,9 +620,7 @@
       <w:r/>
     </w:p>
     <w:p>
-      <w:r>
-        <w:br w:type="page"/>
-      </w:r>
+      <w:r/>
     </w:p>
     <w:p>
       <w:pPr>
@@ -669,7 +665,7 @@
         <w:spacing w:before="40" w:after="80" w:line="300" w:lineRule="auto"/>
       </w:pPr>
       <w:r>
-        <w:t>Em cũng xin gửi lời cảm ơn tới tập thể các bạn sinh viên lớp CNTT K24 đã luôn đồng hành, chia sẻ kinh nghiệm trong quá trình cùng nhau học tập và kiểm thử hệ thống.</w:t>
+        <w:t>Em cũng xin gửi lời cảm ơn tới tập thể các bạn sinh viên lớp CNTT K23L đã luôn đồng hành, chia sẻ kinh nghiệm trong quá trình cùng nhau học tập và kiểm thử hệ thống.</w:t>
       </w:r>
     </w:p>
     <w:p>
@@ -708,7 +704,7 @@
         <w:spacing w:before="40" w:after="80" w:line="300" w:lineRule="auto"/>
       </w:pPr>
       <w:r>
-        <w:t xml:space="preserve">*Lớp CNTT K24 – ICTU*  </w:t>
+        <w:t xml:space="preserve">*Lớp CNTT K23L – ICTU*  </w:t>
       </w:r>
     </w:p>
     <w:p>
@@ -725,9 +721,7 @@
       <w:r/>
     </w:p>
     <w:p>
-      <w:r>
-        <w:br w:type="page"/>
-      </w:r>
+      <w:r/>
     </w:p>
     <w:p>
       <w:pPr>
@@ -807,7 +801,7 @@
         <w:t>"Recruitment and Job Board Platform"</w:t>
       </w:r>
       <w:r>
-        <w:t xml:space="preserve"> (Topic 33 in the Software System Deployment and Administration curriculum) was conceived and engineered by student Nguyen Nhu Thanh (Class CNTT K24, ICTU) under the supervision of MSc. Vu Van Dien as a comprehensive, production-ready solution that reconciles intuitive user experience, robust data integrity, and stellar system operations.</w:t>
+        <w:t xml:space="preserve"> (Topic 33 in the Software System Deployment and Administration curriculum) was conceived and engineered by student Nguyen Nhu Thanh (Class CNTT K23L, ICTU) under the supervision of MSc. Vu Van Dien as a comprehensive, production-ready solution that reconciles intuitive user experience, robust data integrity, and stellar system operations.</w:t>
       </w:r>
     </w:p>
     <w:p>
@@ -853,7 +847,7 @@
               <w:br/>
               <w:t xml:space="preserve">Website Tuyển Dụng (Job Board), Triển khai và Quản trị Hệ thống Phần mềm, </w:t>
               <w:br/>
-              <w:t xml:space="preserve">Đại học CNTT &amp; Truyền thông Thái Nguyên (ICTU), Lớp CNTT K24, Docker Compose, </w:t>
+              <w:t xml:space="preserve">Đại học CNTT &amp; Truyền thông Thái Nguyên (ICTU), Lớp CNTT K23L, Docker Compose, </w:t>
               <w:br/>
               <w:t xml:space="preserve">Nginx Reverse Proxy, HTTPS SSL, Prometheus, Grafana, Loki, Promtail, LogQL, </w:t>
               <w:br/>
@@ -864,9 +858,7 @@
       </w:tr>
     </w:tbl>
     <w:p>
-      <w:r>
-        <w:br w:type="page"/>
-      </w:r>
+      <w:r/>
     </w:p>
     <w:p>
       <w:pPr>
@@ -1059,7 +1051,7 @@
               <w:rPr>
                 <w:sz w:val="21"/>
               </w:rPr>
-              <w:t>**CNTT K24**</w:t>
+              <w:t>**CNTT K23L**</w:t>
             </w:r>
           </w:p>
         </w:tc>
@@ -2298,9 +2290,7 @@
       </w:pPr>
     </w:p>
     <w:p>
-      <w:r>
-        <w:br w:type="page"/>
-      </w:r>
+      <w:r/>
     </w:p>
     <w:p>
       <w:pPr>
@@ -2463,9 +2453,7 @@
       </w:tr>
     </w:tbl>
     <w:p>
-      <w:r>
-        <w:br w:type="page"/>
-      </w:r>
+      <w:r/>
     </w:p>
     <w:p>
       <w:pPr>
@@ -2579,7 +2567,7 @@
         <w:t>"Hệ thống Website Tuyển dụng và Quản lý Việc làm (Job Board)"</w:t>
       </w:r>
       <w:r>
-        <w:t xml:space="preserve"> (Đề tài số 33) đã được sinh viên Nguyễn Như Thành, lớp CNTT K24, lựa chọn nghiên cứu và phát triển dưới sự hướng dẫn khoa học của ThS. Vũ Văn Diện trong khuôn khổ học phần </w:t>
+        <w:t xml:space="preserve"> (Đề tài số 33) đã được sinh viên Nguyễn Như Thành, lớp CNTT K23L, lựa chọn nghiên cứu và phát triển dưới sự hướng dẫn khoa học của ThS. Vũ Văn Diện trong khuôn khổ học phần </w:t>
       </w:r>
       <w:r>
         <w:rPr>
@@ -2714,9 +2702,7 @@
       </w:r>
     </w:p>
     <w:p>
-      <w:r>
-        <w:br w:type="page"/>
-      </w:r>
+      <w:r/>
     </w:p>
     <w:p>
       <w:pPr>
@@ -4261,9 +4247,7 @@
       </w:pPr>
     </w:p>
     <w:p>
-      <w:r>
-        <w:br w:type="page"/>
-      </w:r>
+      <w:r/>
     </w:p>
     <w:p>
       <w:pPr>
@@ -5029,9 +5013,7 @@
       </w:r>
     </w:p>
     <w:p>
-      <w:r>
-        <w:br w:type="page"/>
-      </w:r>
+      <w:r/>
     </w:p>
     <w:p>
       <w:pPr>
@@ -12393,9 +12375,7 @@
       </w:tr>
     </w:tbl>
     <w:p>
-      <w:r>
-        <w:br w:type="page"/>
-      </w:r>
+      <w:r/>
     </w:p>
     <w:p>
       <w:pPr>
@@ -13659,9 +13639,7 @@
       </w:r>
     </w:p>
     <w:p>
-      <w:r>
-        <w:br w:type="page"/>
-      </w:r>
+      <w:r/>
     </w:p>
     <w:p>
       <w:pPr>
@@ -16777,9 +16755,7 @@
       </w:r>
     </w:p>
     <w:p>
-      <w:r>
-        <w:br w:type="page"/>
-      </w:r>
+      <w:r/>
     </w:p>
     <w:p>
       <w:pPr>
@@ -16812,7 +16788,7 @@
         <w:spacing w:before="40" w:after="80" w:line="300" w:lineRule="auto"/>
       </w:pPr>
       <w:r>
-        <w:t>Trải qua quá trình nghiên cứu lý thuyết và thực hành triển khai đồ án môn học Triển khai và Quản trị Hệ thống Phần mềm tại Trường Đại học Công nghệ Thông tin và Truyền thông (ICTU), sinh viên Nguyễn Như Thành, lớp CNTT K24, đã hoàn thành trọn vẹn toàn bộ các mục tiêu đặt ra ban đầu:</w:t>
+        <w:t>Trải qua quá trình nghiên cứu lý thuyết và thực hành triển khai đồ án môn học Triển khai và Quản trị Hệ thống Phần mềm tại Trường Đại học Công nghệ Thông tin và Truyền thông (ICTU), sinh viên Nguyễn Như Thành, lớp CNTT K23L, đã hoàn thành trọn vẹn toàn bộ các mục tiêu đặt ra ban đầu:</w:t>
       </w:r>
     </w:p>
     <w:p>
@@ -16938,9 +16914,7 @@
       </w:pPr>
     </w:p>
     <w:p>
-      <w:r>
-        <w:br w:type="page"/>
-      </w:r>
+      <w:r/>
     </w:p>
     <w:p>
       <w:pPr>
@@ -17149,7 +17123,7 @@
         <w:spacing w:before="40" w:after="80" w:line="300" w:lineRule="auto"/>
       </w:pPr>
       <w:r>
-        <w:t xml:space="preserve">*Thái Nguyên, ngày 25 tháng 10 năm 2026*  </w:t>
+        <w:t xml:space="preserve">*Thái Nguyên, ngày 26 tháng 10 năm 2026*  </w:t>
       </w:r>
     </w:p>
     <w:p>
@@ -17211,7 +17185,7 @@
         <w:spacing w:before="40" w:after="80" w:line="300" w:lineRule="auto"/>
       </w:pPr>
       <w:r>
-        <w:t>Lớp: CNTT K24 – Khoa Công nghệ Thông tin – ICTU</w:t>
+        <w:t>Lớp: CNTT K23L – Khoa Công nghệ Thông tin – ICTU</w:t>
       </w:r>
     </w:p>
     <w:sectPr>

</xml_diff>